<commit_message>
Expand role access and add inventory batch sync
</commit_message>
<xml_diff>
--- a/output/doc/定稿1-任务书主要内容已填写.docx
+++ b/output/doc/定稿1-任务书主要内容已填写.docx
@@ -6619,6 +6619,42 @@
         <w:t>后端与数据访问技术</w:t>
       </w:r>
       <w:bookmarkEnd w:id="12"/>
+    </w:p>
+    <w:p>
+      <w:pPr>
+        <w:spacing w:line="360" w:lineRule="auto"/>
+        <w:ind w:firstLine="480"/>
+      </w:pPr>
+      <w:r>
+        <w:rPr>
+          <w:sz w:val="24"/>
+        </w:rPr>
+        <w:t>Spring 是一款轻量级的 Java 开发框架，其设计目标在于简化 Java 企业级应用开发。它通过容器统一管理组件对象及其依赖关系，使开发者不必在业务代码中手动完成大量对象创建和装配工作，因此已经成为服务端开发中常用的基础框架之一[11]。Spring Boot 是 Spring 生态中的快速开发框架，它保留了 IoC、AOP 和 Spring MVC 等能力，并通过自动配置、起步依赖和注解机制减少传统 Spring 项目中的 XML 配置，使项目创建、依赖管理和部署过程更加便捷。</w:t>
+      </w:r>
+    </w:p>
+    <w:p>
+      <w:pPr>
+        <w:spacing w:line="360" w:lineRule="auto"/>
+        <w:ind w:firstLine="480"/>
+      </w:pPr>
+      <w:r>
+        <w:rPr>
+          <w:sz w:val="24"/>
+        </w:rPr>
+        <w:t>IoC 即 Inversion of Control，通常译为控制反转，是面向对象编程中的一种重要设计思想。其核心是将对象创建和依赖管理交由 IoC 容器负责，开发者主要关注业务逻辑本身；在 Spring 应用启动过程中，容器会根据配置或注解查找相应依赖并完成注入，这一过程也称为依赖注入[12]。依赖注入常见方式包括构造方法注入、属性注入和接口注入。结合本系统后端代码结构，控制器、业务服务和数据访问组件之间主要采用构造方法注入，使依赖关系在对象创建时即被明确声明。</w:t>
+      </w:r>
+    </w:p>
+    <w:p>
+      <w:pPr>
+        <w:spacing w:line="360" w:lineRule="auto"/>
+        <w:ind w:firstLine="480"/>
+      </w:pPr>
+      <w:r>
+        <w:rPr>
+          <w:sz w:val="24"/>
+        </w:rPr>
+        <w:t>AOP 即 Aspect Oriented Programming，通常译为面向切面编程，它更接近一种面向横切关注点的程序设计思想，而不只是单一的编码技术[13]。在企业级应用中，权限校验、事务控制、日志记录和异常处理等内容往往会分布在多个业务模块中，如果全部写入业务方法，容易造成重复代码并降低可维护性。AOP 的作用是将这类与核心业务关联较弱但又不可缺少的逻辑抽离出来，在需要的位置统一织入，从而减少重复代码并提升代码结构的清晰度[14]。本系统在后端事务处理和安全控制等场景中使用 Spring 相关机制，为申领审批、库存出入库和仓间调拨等业务流程提供基础支撑。</w:t>
+      </w:r>
     </w:p>
     <w:p>
       <w:pPr>

</xml_diff>